<commit_message>
Chạy lại stress test với lớp V1–V3 và CNN9 trên nhịp HUCA gốc; cập nhật bản thảo
- concepts_v3/run_v3: stress_ada.py v3 (lớp khái niệm chính). CBM giữ 0.73–0.76
  ở mọi tỉ lệ bệnh; CBM-Ada 0.738 ở 5% (thấp hơn CBM 0.761), 0.756–0.758 ở 35–50%;
  điểm làm việc trôi 0.87/0.61 (5%) -> 0.59/0.90 (70%). Cùng kết luận với bản v2.
- sensitivity_v7/orig_huca_run: sens_huca.py trên huca.npz gốc. CNN-V1V3 trùng v5_raw;
  AUROC CNN9 = 0.817 -> điền ô còn trống của Bảng 15.
- Bản thảo: cập nhật Mục 3.4 và Bảng 15, dựng lại .docx/.pdf.

Co-Authored-By: Claude Opus 5.5 <noreply@anthropic.com>
Claude-Session: https://claude.ai/code/session_01995Kp9PmdtnSEwW5m9XTFe
</commit_message>
<xml_diff>
--- a/brugada-catt/manuscript/Brugada_CATT_Methods_Results.docx
+++ b/brugada-catt/manuscript/Brugada_CATT_Methods_Results.docx
@@ -13957,7 +13957,7 @@
         <w:t xml:space="preserve"> </w:t>
       </w:r>
       <w:r>
-        <w:t xml:space="preserve">CBM-Ada slightly improved the mean AUROC (0.844) and the worst-case balanced accuracy (0.682). However, it normalizes concepts with statistics of the target batch, and those statistics depend on the batch’s disease prevalence. In the prevalence stress test (run with the version of the concept layer that computes the J point and QRS_w from nine-lead energy):</w:t>
+        <w:t xml:space="preserve">CBM-Ada slightly improved the mean AUROC (0.844) and the worst-case balanced accuracy (0.682). However, it normalizes concepts with statistics of the target batch, and those statistics depend on the batch’s disease prevalence. In the prevalence stress test (target batches of 100 ECGs, 30 draws per prevalence):</w:t>
       </w:r>
     </w:p>
     <w:p>
@@ -13969,7 +13969,7 @@
         </w:numPr>
       </w:pPr>
       <w:r>
-        <w:t xml:space="preserve">The balanced accuracy of the CBM stayed at about 0.72 at every prevalence.</w:t>
+        <w:t xml:space="preserve">The balanced accuracy of the CBM stayed between 0.73 and 0.76 at every prevalence, and its sensitivity and specificity did not move (0.73–0.78 and 0.74–0.75).</w:t>
       </w:r>
     </w:p>
     <w:p>
@@ -13981,7 +13981,7 @@
         </w:numPr>
       </w:pPr>
       <w:r>
-        <w:t xml:space="preserve">The balanced accuracy of CBM-Ada rose from 0.719 at 5% prevalence to 0.740 at 35–50%.</w:t>
+        <w:t xml:space="preserve">The balanced accuracy of CBM-Ada was 0.738 at 5% prevalence, below that of the CBM (0.761), and 0.756–0.758 at 35–50%.</w:t>
       </w:r>
     </w:p>
     <w:p>
@@ -13993,7 +13993,7 @@
         </w:numPr>
       </w:pPr>
       <w:r>
-        <w:t xml:space="preserve">Its operating point drifted with prevalence: sensitivity/specificity 0.86/0.57 at 5%, and 0.61/0.87 at 70%.</w:t>
+        <w:t xml:space="preserve">Its operating point drifted with prevalence: sensitivity/specificity 0.87/0.61 at 5%, and 0.59/0.90 at 70%.</w:t>
       </w:r>
     </w:p>
     <w:p>
@@ -15109,7 +15109,7 @@
         <w:pStyle w:val="FirstParagraph"/>
       </w:pPr>
       <w:r>
-        <w:t xml:space="preserve">The 23 HUCA negatives with a Brugada-type baseline pattern did not cause the shift. Removing them changed the logit shift of the negatives by at most 0.11 logit units (2–3% of the shift for CNN-V1V3, 5–14% for CBM-sd15).</w:t>
+        <w:t xml:space="preserve">The 23 HUCA negatives with a Brugada-type baseline pattern did not cause the shift. Removing them changed the logit shift of the negatives by at most 0.11 logit units (2–3% of the shift for CNN-V1V3, 4–15% for CBM-sd15).</w:t>
       </w:r>
     </w:p>
     <w:bookmarkEnd w:id="43"/>
@@ -24682,7 +24682,7 @@
         <w:rPr>
           <w:sz w:val="20"/>
         </w:rPr>
-        <w:t xml:space="preserve">Sensitivity to the HUCA median-beat construction (natural prevalence, three validation seeds). —, not computed: the 9-lead CNN was not retrained in the original-beat run.</w:t>
+        <w:t xml:space="preserve">Sensitivity to the HUCA median-beat construction (natural prevalence, three validation seeds).</w:t>
       </w:r>
     </w:p>
     <w:tbl>
@@ -24877,7 +24877,7 @@
               <w:rPr>
                 <w:sz w:val="19"/>
               </w:rPr>
-              <w:t xml:space="preserve">—</w:t>
+              <w:t xml:space="preserve">0.817</w:t>
             </w:r>
           </w:p>
         </w:tc>

</xml_diff>